<commit_message>
Refactor Ordem de Serviço templates and forms for improved structure and usability
- Updated the Ordem de Serviço document template to enhance formatting and readability.
- Modified the OrdemServicoForm to change widget classes and improve user experience.
- Added utility functions in views.py for better data handling and formatting.
- Enhanced CSS styles for dark mode and improved layout for various components.
- Refactored JavaScript for handling ofícios selection and synchronization with the form.
- Updated HTML templates to streamline the structure and improve accessibility.
- Introduced new partials for event destinations to modularize the code.
</commit_message>
<xml_diff>
--- a/documentos/resources/ordem_servico_modelos.docx
+++ b/documentos/resources/ordem_servico_modelos.docx
@@ -3,78 +3,382 @@
 <w:document xmlns:o="urn:schemas-microsoft-com:office:office" xmlns:r="http://schemas.openxmlformats.org/officeDocument/2006/relationships" xmlns:v="urn:schemas-microsoft-com:vml" xmlns:w="http://schemas.openxmlformats.org/wordprocessingml/2006/main" xmlns:w10="urn:schemas-microsoft-com:office:word" xmlns:wp="http://schemas.openxmlformats.org/drawingml/2006/wordprocessingDrawing" xmlns:pic="http://schemas.openxmlformats.org/drawingml/2006/picture" xmlns:wps="http://schemas.microsoft.com/office/word/2010/wordprocessingShape" xmlns:wpg="http://schemas.microsoft.com/office/word/2010/wordprocessingGroup" xmlns:mc="http://schemas.openxmlformats.org/markup-compatibility/2006" xmlns:wp14="http://schemas.microsoft.com/office/word/2010/wordprocessingDrawing" xmlns:w14="http://schemas.microsoft.com/office/word/2010/wordml" xmlns:w15="http://schemas.microsoft.com/office/word/2012/wordml" mc:Ignorable="w14 wp14 w15">
   <w:body>
     <w:p>
-      <w:r>
-        <w:t xml:space="preserve">ORDEM DE SERVIÇO Nº {{ordem_de_servico}} - {{unidade_abreviado}}</w:t>
-      </w:r>
-    </w:p>
-    <w:p>
-      <w:r>
-        <w:t xml:space="preserve">Ref.: {{referencia}}</w:t>
-      </w:r>
-    </w:p>
-    <w:p>
-      <w:r>
-        <w:t xml:space="preserve">Eu, {{nome_chefia}}, {{cargo_chefia}} do(a) {{divisao_capitalize}}, no uso das atribuições que me foram conferidas pelo Delegado-Geral Silvio Jacob Rockembach, bem como pelo Conselho da Polícia Civil,</w:t>
-      </w:r>
-    </w:p>
-    <w:p>
-      <w:r>
-        <w:t xml:space="preserve">DETERMINO</w:t>
-      </w:r>
-    </w:p>
-    <w:p>
-      <w:r>
-        <w:t xml:space="preserve">{{determinacao}}</w:t>
-      </w:r>
-    </w:p>
-    <w:p>
-      <w:r>
-        <w:t xml:space="preserve">{% for item in competencias_equipe %}</w:t>
-      </w:r>
-    </w:p>
-    <w:p>
-      <w:r>
-        <w:t xml:space="preserve">• {{ item }};</w:t>
-      </w:r>
-    </w:p>
-    <w:p>
-      <w:r>
-        <w:t xml:space="preserve">{% endfor %}</w:t>
-      </w:r>
-    </w:p>
-    <w:p>
-      <w:r>
-        <w:t xml:space="preserve">{% for justificativa in justificativas %}</w:t>
-      </w:r>
-    </w:p>
-    <w:p>
-      <w:r>
-        <w:t xml:space="preserve">{{ justificativa }}</w:t>
-      </w:r>
-    </w:p>
-    <w:p>
-      <w:r>
-        <w:t xml:space="preserve">{% endfor %}</w:t>
-      </w:r>
-    </w:p>
-    <w:p>
-      <w:r>
-        <w:t xml:space="preserve">{{finalidade}}</w:t>
-      </w:r>
-    </w:p>
-    <w:p>
-      <w:r>
-        <w:t xml:space="preserve">{{sede}}, {{data_atual_extenso}}.</w:t>
-      </w:r>
-    </w:p>
-    <w:p>
-      <w:r>
-        <w:t xml:space="preserve">{{nome_chefia}}</w:t>
-      </w:r>
-    </w:p>
-    <w:p>
-      <w:r>
-        <w:t xml:space="preserve">{{cargo_chefia}}</w:t>
+      <w:pPr>
+        <w:pStyle w:val="Normal"/>
+        <w:spacing w:lineRule="auto" w:line="360"/>
+        <w:jc w:val="center"/>
+        <w:rPr>
+          <w:b/>
+          <w:bCs/>
+        </w:rPr>
+      </w:pPr>
+      <w:r>
+        <w:rPr>
+          <w:b/>
+          <w:bCs/>
+        </w:rPr>
+      </w:r>
+    </w:p>
+    <w:p>
+      <w:pPr>
+        <w:pStyle w:val="Normal"/>
+        <w:spacing w:lineRule="auto" w:line="360"/>
+        <w:jc w:val="center"/>
+        <w:rPr>
+          <w:b/>
+          <w:bCs/>
+        </w:rPr>
+      </w:pPr>
+      <w:r>
+        <w:rPr>
+          <w:b/>
+          <w:bCs/>
+        </w:rPr>
+      </w:r>
+    </w:p>
+    <w:p>
+      <w:pPr>
+        <w:pStyle w:val="Normal"/>
+        <w:spacing w:lineRule="auto" w:line="360"/>
+        <w:jc w:val="center"/>
+        <w:rPr>
+          <w:b/>
+          <w:bCs/>
+        </w:rPr>
+      </w:pPr>
+      <w:r>
+        <w:rPr>
+          <w:b/>
+          <w:bCs/>
+        </w:rPr>
+      </w:r>
+    </w:p>
+    <w:p>
+      <w:pPr>
+        <w:pStyle w:val="Normal"/>
+        <w:spacing w:lineRule="auto" w:line="360"/>
+        <w:jc w:val="center"/>
+        <w:rPr>
+          <w:b/>
+          <w:bCs/>
+        </w:rPr>
+      </w:pPr>
+      <w:r>
+        <w:rPr>
+          <w:b/>
+          <w:bCs/>
+        </w:rPr>
+        <w:t>ORDEM DE SERVIÇO {{ordem_de_servico}} - {{unidade_abreviado}}</w:t>
+      </w:r>
+    </w:p>
+    <w:p>
+      <w:pPr>
+        <w:pStyle w:val="Normal"/>
+        <w:rPr/>
+      </w:pPr>
+      <w:r>
+        <w:rPr/>
+      </w:r>
+    </w:p>
+    <w:p>
+      <w:pPr>
+        <w:pStyle w:val="Normal"/>
+        <w:rPr/>
+      </w:pPr>
+      <w:r>
+        <w:rPr/>
+      </w:r>
+    </w:p>
+    <w:p>
+      <w:pPr>
+        <w:pStyle w:val="Normal"/>
+        <w:rPr/>
+      </w:pPr>
+      <w:r>
+        <w:rPr/>
+        <w:t>Ref.:  Diligências</w:t>
+      </w:r>
+    </w:p>
+    <w:p>
+      <w:pPr>
+        <w:pStyle w:val="Normal"/>
+        <w:rPr/>
+      </w:pPr>
+      <w:r>
+        <w:rPr/>
+      </w:r>
+    </w:p>
+    <w:p>
+      <w:pPr>
+        <w:pStyle w:val="Normal"/>
+        <w:rPr/>
+      </w:pPr>
+      <w:r>
+        <w:rPr/>
+      </w:r>
+    </w:p>
+    <w:p>
+      <w:pPr>
+        <w:pStyle w:val="Normal"/>
+        <w:rPr/>
+      </w:pPr>
+      <w:r>
+        <w:rPr/>
+        <w:t>Eu, {{nome_chefia}}, {{cargo_chefia}} do(a) {{divisao_capitalize}}, no uso das atribuições que me foram conferidas pelo Delegado-Geral Silvio Jacob Rockembach, bem como pelo Conselho da Polícia Civil,</w:t>
+      </w:r>
+    </w:p>
+    <w:p>
+      <w:pPr>
+        <w:pStyle w:val="Normal"/>
+        <w:rPr/>
+      </w:pPr>
+      <w:r>
+        <w:rPr/>
+      </w:r>
+    </w:p>
+    <w:p>
+      <w:pPr>
+        <w:pStyle w:val="Normal"/>
+        <w:rPr/>
+      </w:pPr>
+      <w:r>
+        <w:rPr/>
+      </w:r>
+    </w:p>
+    <w:p>
+      <w:pPr>
+        <w:pStyle w:val="Normal"/>
+        <w:spacing w:lineRule="auto" w:line="360"/>
+        <w:jc w:val="center"/>
+        <w:rPr>
+          <w:b/>
+          <w:bCs/>
+        </w:rPr>
+      </w:pPr>
+      <w:r>
+        <w:rPr>
+          <w:b/>
+          <w:bCs/>
+        </w:rPr>
+        <w:t>DETERMINO</w:t>
+      </w:r>
+    </w:p>
+    <w:p>
+      <w:pPr>
+        <w:pStyle w:val="Normal"/>
+        <w:spacing w:lineRule="auto" w:line="360"/>
+        <w:jc w:val="center"/>
+        <w:rPr>
+          <w:b/>
+          <w:bCs/>
+        </w:rPr>
+      </w:pPr>
+      <w:r>
+        <w:rPr>
+          <w:b/>
+          <w:bCs/>
+        </w:rPr>
+      </w:r>
+    </w:p>
+    <w:p>
+      <w:pPr>
+        <w:pStyle w:val="Normal"/>
+        <w:rPr/>
+      </w:pPr>
+      <w:r>
+        <w:rPr/>
+        <w:t>{{determinacao}}</w:t>
+      </w:r>
+    </w:p>
+    <w:p>
+      <w:pPr>
+        <w:pStyle w:val="Normal"/>
+        <w:rPr/>
+      </w:pPr>
+      <w:r>
+        <w:rPr/>
+        <w:t>{% for item in competencias_equipe %}</w:t>
+      </w:r>
+    </w:p>
+    <w:p>
+      <w:pPr>
+        <w:pStyle w:val="Normal"/>
+        <w:rPr/>
+      </w:pPr>
+      <w:r>
+        <w:rPr/>
+        <w:t xml:space="preserve">• </w:t>
+      </w:r>
+      <w:r>
+        <w:rPr/>
+        <w:t>{{ item }};</w:t>
+      </w:r>
+    </w:p>
+    <w:p>
+      <w:pPr>
+        <w:pStyle w:val="Normal"/>
+        <w:rPr/>
+      </w:pPr>
+      <w:r>
+        <w:rPr/>
+        <w:t>{% endfor %}</w:t>
+      </w:r>
+    </w:p>
+    <w:p>
+      <w:pPr>
+        <w:pStyle w:val="Normal"/>
+        <w:rPr/>
+      </w:pPr>
+      <w:r>
+        <w:rPr/>
+        <w:t>{% for justificativa in justificativas %}</w:t>
+      </w:r>
+    </w:p>
+    <w:p>
+      <w:pPr>
+        <w:pStyle w:val="Normal"/>
+        <w:rPr/>
+      </w:pPr>
+      <w:r>
+        <w:rPr/>
+        <w:t>{{ justificativa }}</w:t>
+      </w:r>
+    </w:p>
+    <w:p>
+      <w:pPr>
+        <w:pStyle w:val="Normal"/>
+        <w:rPr/>
+      </w:pPr>
+      <w:r>
+        <w:rPr/>
+        <w:t>{% endfor %}</w:t>
+      </w:r>
+    </w:p>
+    <w:p>
+      <w:pPr>
+        <w:pStyle w:val="Normal"/>
+        <w:rPr/>
+      </w:pPr>
+      <w:r>
+        <w:rPr/>
+        <w:t>{{finalidade}}</w:t>
+      </w:r>
+    </w:p>
+    <w:p>
+      <w:pPr>
+        <w:pStyle w:val="Normal"/>
+        <w:rPr/>
+      </w:pPr>
+      <w:r>
+        <w:rPr/>
+      </w:r>
+    </w:p>
+    <w:p>
+      <w:pPr>
+        <w:pStyle w:val="Normal"/>
+        <w:rPr/>
+      </w:pPr>
+      <w:r>
+        <w:rPr/>
+      </w:r>
+    </w:p>
+    <w:p>
+      <w:pPr>
+        <w:pStyle w:val="Normal"/>
+        <w:ind w:end="19"/>
+        <w:jc w:val="center"/>
+        <w:rPr>
+          <w:sz w:val="22"/>
+          <w:szCs w:val="22"/>
+        </w:rPr>
+      </w:pPr>
+      <w:r>
+        <w:rPr>
+          <w:sz w:val="22"/>
+          <w:szCs w:val="22"/>
+        </w:rPr>
+        <w:t>{{sede}}, {{data_atual_extenso}}</w:t>
+      </w:r>
+    </w:p>
+    <w:p>
+      <w:pPr>
+        <w:pStyle w:val="Normal"/>
+        <w:spacing w:lineRule="auto" w:line="360"/>
+        <w:ind w:end="19"/>
+        <w:jc w:val="start"/>
+        <w:rPr>
+          <w:sz w:val="22"/>
+          <w:szCs w:val="22"/>
+        </w:rPr>
+      </w:pPr>
+      <w:r>
+        <w:rPr>
+          <w:sz w:val="22"/>
+          <w:szCs w:val="22"/>
+        </w:rPr>
+      </w:r>
+    </w:p>
+    <w:p>
+      <w:pPr>
+        <w:pStyle w:val="Normal"/>
+        <w:spacing w:lineRule="auto" w:line="360"/>
+        <w:ind w:end="19"/>
+        <w:jc w:val="center"/>
+        <w:rPr>
+          <w:b/>
+          <w:bCs/>
+          <w:sz w:val="20"/>
+          <w:szCs w:val="20"/>
+        </w:rPr>
+      </w:pPr>
+      <w:r>
+        <w:rPr>
+          <w:b/>
+          <w:bCs/>
+          <w:sz w:val="20"/>
+          <w:szCs w:val="20"/>
+        </w:rPr>
+        <w:t>{{nome_chefia}}</w:t>
+      </w:r>
+    </w:p>
+    <w:p>
+      <w:pPr>
+        <w:pStyle w:val="Normal"/>
+        <w:spacing w:lineRule="auto" w:line="360"/>
+        <w:ind w:end="19"/>
+        <w:jc w:val="center"/>
+        <w:rPr>
+          <w:b/>
+          <w:bCs/>
+          <w:sz w:val="20"/>
+          <w:szCs w:val="20"/>
+        </w:rPr>
+      </w:pPr>
+      <w:r>
+        <w:rPr>
+          <w:b/>
+          <w:bCs/>
+          <w:sz w:val="20"/>
+          <w:szCs w:val="20"/>
+        </w:rPr>
+        <w:t>{{cargo_chefia}}</w:t>
+      </w:r>
+    </w:p>
+    <w:p>
+      <w:pPr>
+        <w:pStyle w:val="Normal"/>
+        <w:spacing w:lineRule="auto" w:line="360"/>
+        <w:jc w:val="center"/>
+        <w:rPr>
+          <w:b/>
+          <w:bCs/>
+        </w:rPr>
+      </w:pPr>
+      <w:r>
+        <w:rPr>
+          <w:b/>
+          <w:bCs/>
+        </w:rPr>
       </w:r>
     </w:p>
     <w:sectPr>
@@ -1200,6 +1504,7 @@
     <w:qFormat/>
     <w:pPr>
       <w:widowControl/>
+      <w:suppressAutoHyphens w:val="true"/>
       <w:bidi w:val="0"/>
       <w:spacing w:before="0" w:after="0"/>
       <w:jc w:val="both"/>
@@ -1395,6 +1700,32 @@
       <w:rFonts w:cs="Lucida Sans"/>
     </w:rPr>
   </w:style>
+  <w:style w:type="paragraph" w:styleId="Ttulouser">
+    <w:name w:val="Título (user)"/>
+    <w:basedOn w:val="Normal"/>
+    <w:next w:val="BodyText"/>
+    <w:qFormat/>
+    <w:pPr>
+      <w:keepNext w:val="true"/>
+      <w:spacing w:before="240" w:after="120"/>
+    </w:pPr>
+    <w:rPr>
+      <w:rFonts w:ascii="Liberation Sans" w:hAnsi="Liberation Sans" w:eastAsia="Microsoft YaHei" w:cs="Lucida Sans"/>
+      <w:sz w:val="28"/>
+      <w:szCs w:val="28"/>
+    </w:rPr>
+  </w:style>
+  <w:style w:type="paragraph" w:styleId="ndiceuser">
+    <w:name w:val="Índice (user)"/>
+    <w:basedOn w:val="Normal"/>
+    <w:qFormat/>
+    <w:pPr>
+      <w:suppressLineNumbers/>
+    </w:pPr>
+    <w:rPr>
+      <w:rFonts w:cs="Lucida Sans"/>
+    </w:rPr>
+  </w:style>
   <w:style w:type="paragraph" w:styleId="Title">
     <w:name w:val="Title"/>
     <w:basedOn w:val="Normal"/>
@@ -1433,6 +1764,13 @@
       <w:szCs w:val="48"/>
     </w:rPr>
   </w:style>
+  <w:style w:type="paragraph" w:styleId="Cabealhoerodapuser">
+    <w:name w:val="Cabeçalho e rodapé (user)"/>
+    <w:basedOn w:val="Normal"/>
+    <w:qFormat/>
+    <w:pPr/>
+    <w:rPr/>
+  </w:style>
   <w:style w:type="paragraph" w:styleId="Cabealhoerodap">
     <w:name w:val="Cabeçalho e rodapé"/>
     <w:basedOn w:val="Normal"/>
@@ -1442,18 +1780,18 @@
   </w:style>
   <w:style w:type="paragraph" w:styleId="Header">
     <w:name w:val="header"/>
-    <w:basedOn w:val="Cabealhoerodap"/>
+    <w:basedOn w:val="Cabealhoerodapuser"/>
     <w:pPr/>
     <w:rPr/>
   </w:style>
   <w:style w:type="paragraph" w:styleId="Footer">
     <w:name w:val="footer"/>
-    <w:basedOn w:val="Cabealhoerodap"/>
+    <w:basedOn w:val="Cabealhoerodapuser"/>
     <w:pPr/>
     <w:rPr/>
   </w:style>
-  <w:style w:type="numbering" w:styleId="Semlista" w:default="1">
-    <w:name w:val="Sem lista"/>
+  <w:style w:type="numbering" w:styleId="Semlistauser" w:default="1">
+    <w:name w:val="Sem lista (user)"/>
     <w:uiPriority w:val="99"/>
     <w:semiHidden/>
     <w:unhideWhenUsed/>

</xml_diff>